<commit_message>
Advocacy canvas: align its prompts with the reworked days 4 and 5
Story of self, us and now instead of the spark/fight structure; stakeholders
organised by role and documented position rather than likely support;
audience needs instead of personas; objective-led rollout and measurement
levels. Same layout, PDF regenerated and the Word version updated in place.

Co-Authored-By: Claude Opus 5 <noreply@anthropic.com>
</commit_message>
<xml_diff>
--- a/public/downloads/advocacy-canvas.docx
+++ b/public/downloads/advocacy-canvas.docx
@@ -621,7 +621,7 @@
                 <w:sz w:val="15"/>
                 <w:szCs w:val="15"/>
               </w:rPr>
-              <w:t xml:space="preserve">The spark: what made this organisation necessary?</w:t>
+              <w:t xml:space="preserve">Story of self: why do we care?</w:t>
             </w:r>
           </w:p>
           <w:p>
@@ -648,7 +648,7 @@
                 <w:sz w:val="15"/>
                 <w:szCs w:val="15"/>
               </w:rPr>
-              <w:t xml:space="preserve">The people: who came together, and what do they believe?</w:t>
+              <w:t xml:space="preserve">Story of us: what values genuinely connect us?</w:t>
             </w:r>
           </w:p>
           <w:p>
@@ -675,7 +675,7 @@
                 <w:sz w:val="15"/>
                 <w:szCs w:val="15"/>
               </w:rPr>
-              <w:t xml:space="preserve">The fight: what’s at stake, and what happens if we win?</w:t>
+              <w:t xml:space="preserve">Story of now: what choice or challenge needs attention now?</w:t>
             </w:r>
           </w:p>
           <w:p>
@@ -702,7 +702,7 @@
                 <w:sz w:val="15"/>
                 <w:szCs w:val="15"/>
               </w:rPr>
-              <w:t xml:space="preserve">The invitation: what do we ask people to do?</w:t>
+              <w:t xml:space="preserve">Is every claim sourced, and every story authentic?</w:t>
             </w:r>
           </w:p>
         </w:tc>
@@ -774,7 +774,7 @@
                 <w:sz w:val="15"/>
                 <w:szCs w:val="15"/>
               </w:rPr>
-              <w:t xml:space="preserve">Rank them by influence, likely support and alignment.</w:t>
+              <w:t xml:space="preserve">Organise them by formal role, documented position and influence.</w:t>
             </w:r>
           </w:p>
           <w:p>
@@ -801,7 +801,7 @@
                 <w:sz w:val="15"/>
                 <w:szCs w:val="15"/>
               </w:rPr>
-              <w:t xml:space="preserve">Who are the people we want to reach?</w:t>
+              <w:t xml:space="preserve">What do our audiences need to know first?</w:t>
             </w:r>
           </w:p>
           <w:p>
@@ -828,7 +828,7 @@
                 <w:sz w:val="15"/>
                 <w:szCs w:val="15"/>
               </w:rPr>
-              <w:t xml:space="preserve">Who did we leave out?</w:t>
+              <w:t xml:space="preserve">Who could we be overlooking, and who have we spoken to?</w:t>
             </w:r>
           </w:p>
         </w:tc>
@@ -900,7 +900,7 @@
                 <w:sz w:val="15"/>
                 <w:szCs w:val="15"/>
               </w:rPr>
-              <w:t xml:space="preserve">The core message for social, poster and email</w:t>
+              <w:t xml:space="preserve">One approved core message for social, poster and email</w:t>
             </w:r>
           </w:p>
           <w:p>
@@ -972,7 +972,7 @@
                 <w:sz w:val="15"/>
                 <w:szCs w:val="15"/>
               </w:rPr>
-              <w:t xml:space="preserve">Visuals and video that carry the message</w:t>
+              <w:t xml:space="preserve">A visual brief first, then visuals and video</w:t>
             </w:r>
           </w:p>
           <w:p>
@@ -999,7 +999,7 @@
                 <w:sz w:val="15"/>
                 <w:szCs w:val="15"/>
               </w:rPr>
-              <w:t xml:space="preserve">A seven-day rollout, channel by channel</w:t>
+              <w:t xml:space="preserve">A seven-day rollout built around the objective</w:t>
             </w:r>
           </w:p>
           <w:p>
@@ -1026,7 +1026,7 @@
                 <w:sz w:val="15"/>
                 <w:szCs w:val="15"/>
               </w:rPr>
-              <w:t xml:space="preserve">What we’ll measure, and what we do if it’s low</w:t>
+              <w:t xml:space="preserve">Exposure, attention, action and outcome, measured apart</w:t>
             </w:r>
           </w:p>
           <w:p>
@@ -1274,7 +1274,7 @@
                 <w:sz w:val="14"/>
                 <w:szCs w:val="14"/>
               </w:rPr>
-              <w:t xml:space="preserve">Who we are, mission and values, recent activity (1.1)</w:t>
+              <w:t xml:space="preserve">Verified facts, priorities, recent activity (1.1)</w:t>
             </w:r>
           </w:p>
         </w:tc>
@@ -1308,7 +1308,7 @@
                 <w:sz w:val="22"/>
                 <w:szCs w:val="22"/>
               </w:rPr>
-              <w:t xml:space="preserve">Our assistant’s brief</w:t>
+              <w:t xml:space="preserve">Our AI project brief</w:t>
             </w:r>
           </w:p>
           <w:p>
@@ -1324,7 +1324,7 @@
                 <w:sz w:val="14"/>
                 <w:szCs w:val="14"/>
               </w:rPr>
-              <w:t xml:space="preserve">Custom instructions saved in our AI tool (1.2)</w:t>
+              <w:t xml:space="preserve">Reusable project brief, reviewed first (1.2)</w:t>
             </w:r>
           </w:p>
         </w:tc>
@@ -1374,7 +1374,7 @@
                 <w:sz w:val="14"/>
                 <w:szCs w:val="14"/>
               </w:rPr>
-              <w:t xml:space="preserve">Research, perspectives, statistics, what’s missing (2)</w:t>
+              <w:t xml:space="preserve">Established, contested, gaps, primary sources (2)</w:t>
             </w:r>
           </w:p>
         </w:tc>
@@ -1595,7 +1595,7 @@
                 <w:sz w:val="15"/>
                 <w:szCs w:val="15"/>
               </w:rPr>
-              <w:t xml:space="preserve">Stakeholders and links verified</w:t>
+              <w:t xml:space="preserve">Stakeholder roles and sources verified</w:t>
             </w:r>
           </w:p>
         </w:tc>

</xml_diff>